<commit_message>
Documentation now link to Box
</commit_message>
<xml_diff>
--- a/tutorials/flex_ro/documentation/pricetaker_changes.docx
+++ b/tutorials/flex_ro/documentation/pricetaker_changes.docx
@@ -20,1014 +20,22 @@
       </w:r>
       <w:proofErr w:type="spellEnd"/>
       <w:r>
-        <w:t xml:space="preserve">. </w:t>
+        <w:t>.</w:t>
       </w:r>
-      <w:proofErr w:type="gramStart"/>
       <w:r>
-        <w:t>Also</w:t>
-      </w:r>
-      <w:proofErr w:type="gramEnd"/>
-      <w:r>
-        <w:t xml:space="preserve"> can outline exactly how those changes could be incorporated into a tutorial</w:t>
-      </w:r>
-    </w:p>
-    <w:p/>
-    <w:p>
-      <w:pPr>
-        <w:pStyle w:val="ListParagraph"/>
-        <w:numPr>
-          <w:ilvl w:val="0"/>
-          <w:numId w:val="1"/>
-        </w:numPr>
-        <w:spacing w:after="0" w:line="240" w:lineRule="auto"/>
-      </w:pPr>
-      <w:r>
-        <w:t>Energy use as a function of flowrate instead of recovery</w:t>
+        <w:t xml:space="preserve"> Currently this document is in Box, but could be added to the PR. </w:t>
       </w:r>
     </w:p>
     <w:p>
-      <w:r>
-        <w:t xml:space="preserve">This required a reworking of the unit models and specifically the energy intensity functions. The energy intensity bounds also were not working properly. </w:t>
-      </w:r>
+      <w:hyperlink r:id="rId5" w:history="1">
+        <w:r>
+          <w:rPr>
+            <w:rStyle w:val="Hyperlink"/>
+          </w:rPr>
+          <w:t>https://nlr.app.box.com/file/2204457854240</w:t>
+        </w:r>
+      </w:hyperlink>
     </w:p>
-    <w:p/>
-    <w:p/>
-    <w:p>
-      <w:pPr>
-        <w:pStyle w:val="ListParagraph"/>
-        <w:numPr>
-          <w:ilvl w:val="0"/>
-          <w:numId w:val="1"/>
-        </w:numPr>
-        <w:spacing w:after="0" w:line="240" w:lineRule="auto"/>
-      </w:pPr>
-      <w:r>
-        <w:t>Replacement cost as a function of flexibility</w:t>
-      </w:r>
-    </w:p>
-    <w:p/>
-    <w:p>
-      <w:r>
-        <w:t>Total replacement cost is function of the component cost (</w:t>
-      </w:r>
-      <w:proofErr w:type="spellStart"/>
-      <w:r>
-        <w:t>C</w:t>
-      </w:r>
-      <w:r>
-        <w:rPr>
-          <w:vertAlign w:val="subscript"/>
-        </w:rPr>
-        <w:t>comp</w:t>
-      </w:r>
-      <w:proofErr w:type="spellEnd"/>
-      <w:r>
-        <w:t>), its lifetime under continuous operations (</w:t>
-      </w:r>
-      <w:proofErr w:type="spellStart"/>
-      <w:r>
-        <w:t>n</w:t>
-      </w:r>
-      <w:r>
-        <w:rPr>
-          <w:vertAlign w:val="subscript"/>
-        </w:rPr>
-        <w:t>cont</w:t>
-      </w:r>
-      <w:proofErr w:type="spellEnd"/>
-      <w:r>
-        <w:t>), the reduction in lifetime expected by flexible operations (</w:t>
-      </w:r>
-      <w:proofErr w:type="spellStart"/>
-      <w:r>
-        <w:t>p</w:t>
-      </w:r>
-      <w:r>
-        <w:rPr>
-          <w:vertAlign w:val="subscript"/>
-        </w:rPr>
-        <w:t>max</w:t>
-      </w:r>
-      <w:proofErr w:type="spellEnd"/>
-      <w:r>
-        <w:t xml:space="preserve">), and the degree of flexibility (F). F = 1 means the maximum lifetime reduction is being applied. </w:t>
-      </w:r>
-    </w:p>
-    <w:p>
-      <w:r>
-        <w:t xml:space="preserve">  </w:t>
-      </w:r>
-    </w:p>
-    <w:p>
-      <m:oMathPara>
-        <m:oMath>
-          <m:sSub>
-            <m:sSubPr>
-              <m:ctrlPr>
-                <w:rPr>
-                  <w:rFonts w:ascii="Cambria Math" w:hAnsi="Cambria Math"/>
-                  <w:i/>
-                </w:rPr>
-              </m:ctrlPr>
-            </m:sSubPr>
-            <m:e>
-              <m:r>
-                <w:rPr>
-                  <w:rFonts w:ascii="Cambria Math" w:hAnsi="Cambria Math"/>
-                </w:rPr>
-                <m:t>C</m:t>
-              </m:r>
-            </m:e>
-            <m:sub>
-              <m:r>
-                <w:rPr>
-                  <w:rFonts w:ascii="Cambria Math" w:hAnsi="Cambria Math"/>
-                </w:rPr>
-                <m:t>repl</m:t>
-              </m:r>
-            </m:sub>
-          </m:sSub>
-          <m:r>
-            <w:rPr>
-              <w:rFonts w:ascii="Cambria Math" w:hAnsi="Cambria Math"/>
-            </w:rPr>
-            <m:t>=</m:t>
-          </m:r>
-          <m:f>
-            <m:fPr>
-              <m:ctrlPr>
-                <w:rPr>
-                  <w:rFonts w:ascii="Cambria Math" w:hAnsi="Cambria Math"/>
-                  <w:i/>
-                </w:rPr>
-              </m:ctrlPr>
-            </m:fPr>
-            <m:num>
-              <m:sSub>
-                <m:sSubPr>
-                  <m:ctrlPr>
-                    <w:rPr>
-                      <w:rFonts w:ascii="Cambria Math" w:hAnsi="Cambria Math"/>
-                      <w:i/>
-                    </w:rPr>
-                  </m:ctrlPr>
-                </m:sSubPr>
-                <m:e>
-                  <m:r>
-                    <w:rPr>
-                      <w:rFonts w:ascii="Cambria Math" w:hAnsi="Cambria Math"/>
-                    </w:rPr>
-                    <m:t>C</m:t>
-                  </m:r>
-                </m:e>
-                <m:sub>
-                  <m:r>
-                    <w:rPr>
-                      <w:rFonts w:ascii="Cambria Math" w:hAnsi="Cambria Math"/>
-                    </w:rPr>
-                    <m:t>comp</m:t>
-                  </m:r>
-                </m:sub>
-              </m:sSub>
-            </m:num>
-            <m:den>
-              <m:sSub>
-                <m:sSubPr>
-                  <m:ctrlPr>
-                    <w:rPr>
-                      <w:rFonts w:ascii="Cambria Math" w:hAnsi="Cambria Math"/>
-                      <w:i/>
-                    </w:rPr>
-                  </m:ctrlPr>
-                </m:sSubPr>
-                <m:e>
-                  <m:r>
-                    <w:rPr>
-                      <w:rFonts w:ascii="Cambria Math" w:hAnsi="Cambria Math"/>
-                    </w:rPr>
-                    <m:t>n</m:t>
-                  </m:r>
-                </m:e>
-                <m:sub>
-                  <m:r>
-                    <w:rPr>
-                      <w:rFonts w:ascii="Cambria Math" w:hAnsi="Cambria Math"/>
-                    </w:rPr>
-                    <m:t>cont</m:t>
-                  </m:r>
-                </m:sub>
-              </m:sSub>
-              <m:r>
-                <w:rPr>
-                  <w:rFonts w:ascii="Cambria Math" w:hAnsi="Cambria Math"/>
-                </w:rPr>
-                <m:t>*</m:t>
-              </m:r>
-              <m:d>
-                <m:dPr>
-                  <m:ctrlPr>
-                    <w:rPr>
-                      <w:rFonts w:ascii="Cambria Math" w:hAnsi="Cambria Math"/>
-                      <w:i/>
-                    </w:rPr>
-                  </m:ctrlPr>
-                </m:dPr>
-                <m:e>
-                  <m:r>
-                    <w:rPr>
-                      <w:rFonts w:ascii="Cambria Math" w:hAnsi="Cambria Math"/>
-                    </w:rPr>
-                    <m:t>1-</m:t>
-                  </m:r>
-                  <m:sSub>
-                    <m:sSubPr>
-                      <m:ctrlPr>
-                        <w:rPr>
-                          <w:rFonts w:ascii="Cambria Math" w:hAnsi="Cambria Math"/>
-                          <w:i/>
-                        </w:rPr>
-                      </m:ctrlPr>
-                    </m:sSubPr>
-                    <m:e>
-                      <m:r>
-                        <w:rPr>
-                          <w:rFonts w:ascii="Cambria Math" w:hAnsi="Cambria Math"/>
-                        </w:rPr>
-                        <m:t>p</m:t>
-                      </m:r>
-                    </m:e>
-                    <m:sub>
-                      <m:r>
-                        <w:rPr>
-                          <w:rFonts w:ascii="Cambria Math" w:hAnsi="Cambria Math"/>
-                        </w:rPr>
-                        <m:t>max</m:t>
-                      </m:r>
-                    </m:sub>
-                  </m:sSub>
-                  <m:r>
-                    <w:rPr>
-                      <w:rFonts w:ascii="Cambria Math" w:hAnsi="Cambria Math"/>
-                    </w:rPr>
-                    <m:t>*F</m:t>
-                  </m:r>
-                </m:e>
-              </m:d>
-            </m:den>
-          </m:f>
-          <m:r>
-            <w:rPr>
-              <w:rFonts w:ascii="Cambria Math" w:hAnsi="Cambria Math"/>
-            </w:rPr>
-            <m:t>*</m:t>
-          </m:r>
-          <m:f>
-            <m:fPr>
-              <m:ctrlPr>
-                <w:rPr>
-                  <w:rFonts w:ascii="Cambria Math" w:hAnsi="Cambria Math"/>
-                  <w:i/>
-                </w:rPr>
-              </m:ctrlPr>
-            </m:fPr>
-            <m:num>
-              <m:sSub>
-                <m:sSubPr>
-                  <m:ctrlPr>
-                    <w:rPr>
-                      <w:rFonts w:ascii="Cambria Math" w:hAnsi="Cambria Math"/>
-                      <w:i/>
-                    </w:rPr>
-                  </m:ctrlPr>
-                </m:sSubPr>
-                <m:e>
-                  <m:r>
-                    <w:rPr>
-                      <w:rFonts w:ascii="Cambria Math" w:hAnsi="Cambria Math"/>
-                    </w:rPr>
-                    <m:t>#</m:t>
-                  </m:r>
-                </m:e>
-                <m:sub>
-                  <m:r>
-                    <w:rPr>
-                      <w:rFonts w:ascii="Cambria Math" w:hAnsi="Cambria Math"/>
-                    </w:rPr>
-                    <m:t>months</m:t>
-                  </m:r>
-                </m:sub>
-              </m:sSub>
-            </m:num>
-            <m:den>
-              <m:r>
-                <w:rPr>
-                  <w:rFonts w:ascii="Cambria Math" w:hAnsi="Cambria Math"/>
-                </w:rPr>
-                <m:t>12</m:t>
-              </m:r>
-            </m:den>
-          </m:f>
-        </m:oMath>
-      </m:oMathPara>
-    </w:p>
-    <w:p/>
-    <w:p>
-      <w:r>
-        <w:t xml:space="preserve">Degree of flexibility is defined as the total number of shutdowns across all timesteps (T) and </w:t>
-      </w:r>
-      <w:proofErr w:type="spellStart"/>
-      <w:r>
-        <w:t>ro</w:t>
-      </w:r>
-      <w:proofErr w:type="spellEnd"/>
-      <w:r>
-        <w:t xml:space="preserve"> skids (N) divided by the number of days, number of skids, and the number of shutdowns per day that corresponds to upper estimate of the equipment degradation. The value is capped at one.</w:t>
-      </w:r>
-    </w:p>
-    <w:p/>
-    <w:p>
-      <w:pPr>
-        <w:rPr>
-          <w:rFonts w:eastAsiaTheme="minorEastAsia"/>
-        </w:rPr>
-      </w:pPr>
-      <m:oMathPara>
-        <m:oMath>
-          <m:r>
-            <w:rPr>
-              <w:rFonts w:ascii="Cambria Math" w:hAnsi="Cambria Math"/>
-            </w:rPr>
-            <m:t>F=</m:t>
-          </m:r>
-          <m:func>
-            <m:funcPr>
-              <m:ctrlPr>
-                <w:rPr>
-                  <w:rFonts w:ascii="Cambria Math" w:hAnsi="Cambria Math"/>
-                  <w:i/>
-                </w:rPr>
-              </m:ctrlPr>
-            </m:funcPr>
-            <m:fName>
-              <m:r>
-                <m:rPr>
-                  <m:sty m:val="p"/>
-                </m:rPr>
-                <w:rPr>
-                  <w:rFonts w:ascii="Cambria Math" w:hAnsi="Cambria Math"/>
-                </w:rPr>
-                <m:t>min</m:t>
-              </m:r>
-            </m:fName>
-            <m:e>
-              <m:d>
-                <m:dPr>
-                  <m:ctrlPr>
-                    <w:rPr>
-                      <w:rFonts w:ascii="Cambria Math" w:hAnsi="Cambria Math"/>
-                      <w:i/>
-                    </w:rPr>
-                  </m:ctrlPr>
-                </m:dPr>
-                <m:e>
-                  <m:r>
-                    <w:rPr>
-                      <w:rFonts w:ascii="Cambria Math" w:hAnsi="Cambria Math"/>
-                    </w:rPr>
-                    <m:t>1,</m:t>
-                  </m:r>
-                  <m:f>
-                    <m:fPr>
-                      <m:ctrlPr>
-                        <w:rPr>
-                          <w:rFonts w:ascii="Cambria Math" w:hAnsi="Cambria Math"/>
-                          <w:i/>
-                        </w:rPr>
-                      </m:ctrlPr>
-                    </m:fPr>
-                    <m:num>
-                      <m:nary>
-                        <m:naryPr>
-                          <m:chr m:val="∑"/>
-                          <m:limLoc m:val="undOvr"/>
-                          <m:ctrlPr>
-                            <w:rPr>
-                              <w:rFonts w:ascii="Cambria Math" w:hAnsi="Cambria Math"/>
-                              <w:i/>
-                            </w:rPr>
-                          </m:ctrlPr>
-                        </m:naryPr>
-                        <m:sub>
-                          <m:r>
-                            <w:rPr>
-                              <w:rFonts w:ascii="Cambria Math" w:hAnsi="Cambria Math"/>
-                            </w:rPr>
-                            <m:t>t</m:t>
-                          </m:r>
-                        </m:sub>
-                        <m:sup>
-                          <m:r>
-                            <w:rPr>
-                              <w:rFonts w:ascii="Cambria Math" w:hAnsi="Cambria Math"/>
-                            </w:rPr>
-                            <m:t>T</m:t>
-                          </m:r>
-                        </m:sup>
-                        <m:e>
-                          <m:nary>
-                            <m:naryPr>
-                              <m:chr m:val="∑"/>
-                              <m:limLoc m:val="undOvr"/>
-                              <m:ctrlPr>
-                                <w:rPr>
-                                  <w:rFonts w:ascii="Cambria Math" w:hAnsi="Cambria Math"/>
-                                  <w:i/>
-                                </w:rPr>
-                              </m:ctrlPr>
-                            </m:naryPr>
-                            <m:sub>
-                              <m:r>
-                                <w:rPr>
-                                  <w:rFonts w:ascii="Cambria Math" w:hAnsi="Cambria Math"/>
-                                </w:rPr>
-                                <m:t>i</m:t>
-                              </m:r>
-                            </m:sub>
-                            <m:sup>
-                              <m:r>
-                                <w:rPr>
-                                  <w:rFonts w:ascii="Cambria Math" w:hAnsi="Cambria Math"/>
-                                </w:rPr>
-                                <m:t>N</m:t>
-                              </m:r>
-                            </m:sup>
-                            <m:e>
-                              <m:sSub>
-                                <m:sSubPr>
-                                  <m:ctrlPr>
-                                    <w:rPr>
-                                      <w:rFonts w:ascii="Cambria Math" w:hAnsi="Cambria Math"/>
-                                      <w:i/>
-                                    </w:rPr>
-                                  </m:ctrlPr>
-                                </m:sSubPr>
-                                <m:e>
-                                  <m:r>
-                                    <w:rPr>
-                                      <w:rFonts w:ascii="Cambria Math" w:hAnsi="Cambria Math"/>
-                                    </w:rPr>
-                                    <m:t>s</m:t>
-                                  </m:r>
-                                </m:e>
-                                <m:sub>
-                                  <m:r>
-                                    <w:rPr>
-                                      <w:rFonts w:ascii="Cambria Math" w:hAnsi="Cambria Math"/>
-                                    </w:rPr>
-                                    <m:t>i,t</m:t>
-                                  </m:r>
-                                </m:sub>
-                              </m:sSub>
-                            </m:e>
-                          </m:nary>
-                        </m:e>
-                      </m:nary>
-                    </m:num>
-                    <m:den>
-                      <m:sSub>
-                        <m:sSubPr>
-                          <m:ctrlPr>
-                            <w:rPr>
-                              <w:rFonts w:ascii="Cambria Math" w:hAnsi="Cambria Math"/>
-                              <w:i/>
-                            </w:rPr>
-                          </m:ctrlPr>
-                        </m:sSubPr>
-                        <m:e>
-                          <m:r>
-                            <w:rPr>
-                              <w:rFonts w:ascii="Cambria Math" w:hAnsi="Cambria Math"/>
-                            </w:rPr>
-                            <m:t>#</m:t>
-                          </m:r>
-                        </m:e>
-                        <m:sub>
-                          <m:r>
-                            <w:rPr>
-                              <w:rFonts w:ascii="Cambria Math" w:hAnsi="Cambria Math"/>
-                            </w:rPr>
-                            <m:t>daily shutdowns</m:t>
-                          </m:r>
-                        </m:sub>
-                      </m:sSub>
-                      <m:r>
-                        <w:rPr>
-                          <w:rFonts w:ascii="Cambria Math" w:hAnsi="Cambria Math"/>
-                        </w:rPr>
-                        <m:t>*</m:t>
-                      </m:r>
-                      <m:sSub>
-                        <m:sSubPr>
-                          <m:ctrlPr>
-                            <w:rPr>
-                              <w:rFonts w:ascii="Cambria Math" w:hAnsi="Cambria Math"/>
-                              <w:i/>
-                            </w:rPr>
-                          </m:ctrlPr>
-                        </m:sSubPr>
-                        <m:e>
-                          <m:r>
-                            <w:rPr>
-                              <w:rFonts w:ascii="Cambria Math" w:hAnsi="Cambria Math"/>
-                            </w:rPr>
-                            <m:t>#</m:t>
-                          </m:r>
-                        </m:e>
-                        <m:sub>
-                          <m:r>
-                            <w:rPr>
-                              <w:rFonts w:ascii="Cambria Math" w:hAnsi="Cambria Math"/>
-                            </w:rPr>
-                            <m:t>days</m:t>
-                          </m:r>
-                        </m:sub>
-                      </m:sSub>
-                      <m:r>
-                        <w:rPr>
-                          <w:rFonts w:ascii="Cambria Math" w:hAnsi="Cambria Math"/>
-                        </w:rPr>
-                        <m:t>*</m:t>
-                      </m:r>
-                      <m:sSub>
-                        <m:sSubPr>
-                          <m:ctrlPr>
-                            <w:rPr>
-                              <w:rFonts w:ascii="Cambria Math" w:hAnsi="Cambria Math"/>
-                              <w:i/>
-                            </w:rPr>
-                          </m:ctrlPr>
-                        </m:sSubPr>
-                        <m:e>
-                          <m:r>
-                            <w:rPr>
-                              <w:rFonts w:ascii="Cambria Math" w:hAnsi="Cambria Math"/>
-                            </w:rPr>
-                            <m:t>#</m:t>
-                          </m:r>
-                        </m:e>
-                        <m:sub>
-                          <m:r>
-                            <w:rPr>
-                              <w:rFonts w:ascii="Cambria Math" w:hAnsi="Cambria Math"/>
-                            </w:rPr>
-                            <m:t>skids</m:t>
-                          </m:r>
-                        </m:sub>
-                      </m:sSub>
-                    </m:den>
-                  </m:f>
-                </m:e>
-              </m:d>
-            </m:e>
-          </m:func>
-        </m:oMath>
-      </m:oMathPara>
-    </w:p>
-    <w:p>
-      <w:pPr>
-        <w:rPr>
-          <w:rFonts w:eastAsiaTheme="minorEastAsia"/>
-        </w:rPr>
-      </w:pPr>
-    </w:p>
-    <w:p>
-      <w:pPr>
-        <w:rPr>
-          <w:rFonts w:eastAsiaTheme="minorEastAsia"/>
-        </w:rPr>
-      </w:pPr>
-      <w:r>
-        <w:rPr>
-          <w:rFonts w:eastAsiaTheme="minorEastAsia"/>
-        </w:rPr>
-        <w:t xml:space="preserve">The </w:t>
-      </w:r>
-      <w:proofErr w:type="spellStart"/>
-      <w:r>
-        <w:rPr>
-          <w:rFonts w:eastAsiaTheme="minorEastAsia"/>
-        </w:rPr>
-        <w:t>pyomo</w:t>
-      </w:r>
-      <w:proofErr w:type="spellEnd"/>
-      <w:r>
-        <w:rPr>
-          <w:rFonts w:eastAsiaTheme="minorEastAsia"/>
-        </w:rPr>
-        <w:t xml:space="preserve"> implementation of this </w:t>
-      </w:r>
-      <w:proofErr w:type="gramStart"/>
-      <w:r>
-        <w:rPr>
-          <w:rFonts w:eastAsiaTheme="minorEastAsia"/>
-        </w:rPr>
-        <w:t>more</w:t>
-      </w:r>
-      <w:proofErr w:type="gramEnd"/>
-      <w:r>
-        <w:rPr>
-          <w:rFonts w:eastAsiaTheme="minorEastAsia"/>
-        </w:rPr>
-        <w:t xml:space="preserve"> complicated, using the big-M formulation to implement the </w:t>
-      </w:r>
-      <w:proofErr w:type="spellStart"/>
-      <w:r>
-        <w:rPr>
-          <w:rFonts w:eastAsiaTheme="minorEastAsia"/>
-        </w:rPr>
-        <w:t>min</w:t>
-      </w:r>
-      <w:proofErr w:type="spellEnd"/>
-      <w:r>
-        <w:rPr>
-          <w:rFonts w:eastAsiaTheme="minorEastAsia"/>
-        </w:rPr>
-        <w:t xml:space="preserve"> function.</w:t>
-      </w:r>
-    </w:p>
-    <w:p>
-      <w:pPr>
-        <w:rPr>
-          <w:rFonts w:eastAsiaTheme="minorEastAsia"/>
-        </w:rPr>
-      </w:pPr>
-    </w:p>
-    <w:p>
-      <w:pPr>
-        <w:rPr>
-          <w:rFonts w:eastAsiaTheme="minorEastAsia"/>
-        </w:rPr>
-      </w:pPr>
-    </w:p>
-    <w:p>
-      <w:pPr>
-        <w:rPr>
-          <w:rFonts w:eastAsiaTheme="minorEastAsia"/>
-        </w:rPr>
-      </w:pPr>
-    </w:p>
-    <w:p/>
-    <w:p>
-      <w:pPr>
-        <w:pStyle w:val="ListParagraph"/>
-        <w:numPr>
-          <w:ilvl w:val="0"/>
-          <w:numId w:val="1"/>
-        </w:numPr>
-        <w:spacing w:after="0" w:line="240" w:lineRule="auto"/>
-      </w:pPr>
-      <w:r>
-        <w:t>Flow-based costs</w:t>
-      </w:r>
-    </w:p>
-    <w:p>
-      <w:r>
-        <w:t>Brine, feed, and chemicals all have a cost ($/m</w:t>
-      </w:r>
-      <w:r>
-        <w:rPr>
-          <w:vertAlign w:val="superscript"/>
-        </w:rPr>
-        <w:t>3</w:t>
-      </w:r>
-      <w:r>
-        <w:t>) that is applied to the respective flowrate.</w:t>
-      </w:r>
-    </w:p>
-    <w:p/>
-    <w:p>
-      <w:pPr>
-        <w:pStyle w:val="ListParagraph"/>
-        <w:numPr>
-          <w:ilvl w:val="0"/>
-          <w:numId w:val="1"/>
-        </w:numPr>
-        <w:spacing w:after="0" w:line="240" w:lineRule="auto"/>
-      </w:pPr>
-      <w:r>
-        <w:t>Penalty for excessive flowrate changes.</w:t>
-      </w:r>
-    </w:p>
-    <w:p>
-      <w:r>
-        <w:t>Because the flowrate is unfixed compared to the fixed recovery implementation, the solver often gives random fluctuations. To avoid this, a penalty term for flow changes was implemented. Binary variables were created to track when the flowrate changes between hours.</w:t>
-      </w:r>
-    </w:p>
-    <w:p>
-      <m:oMathPara>
-        <m:oMath>
-          <m:sSub>
-            <m:sSubPr>
-              <m:ctrlPr>
-                <w:rPr>
-                  <w:rFonts w:ascii="Cambria Math" w:hAnsi="Cambria Math"/>
-                  <w:i/>
-                </w:rPr>
-              </m:ctrlPr>
-            </m:sSubPr>
-            <m:e>
-              <m:r>
-                <w:rPr>
-                  <w:rFonts w:ascii="Cambria Math" w:hAnsi="Cambria Math"/>
-                </w:rPr>
-                <m:t>b</m:t>
-              </m:r>
-            </m:e>
-            <m:sub>
-              <m:r>
-                <w:rPr>
-                  <w:rFonts w:ascii="Cambria Math" w:hAnsi="Cambria Math"/>
-                </w:rPr>
-                <m:t>flow</m:t>
-              </m:r>
-            </m:sub>
-          </m:sSub>
-          <m:r>
-            <w:rPr>
-              <w:rFonts w:ascii="Cambria Math" w:hAnsi="Cambria Math"/>
-            </w:rPr>
-            <m:t>*M≥</m:t>
-          </m:r>
-          <m:r>
-            <w:rPr>
-              <w:rFonts w:ascii="Cambria Math" w:eastAsiaTheme="minorEastAsia" w:hAnsi="Cambria Math"/>
-            </w:rPr>
-            <m:t xml:space="preserve"> </m:t>
-          </m:r>
-          <m:sSub>
-            <m:sSubPr>
-              <m:ctrlPr>
-                <w:rPr>
-                  <w:rFonts w:ascii="Cambria Math" w:eastAsiaTheme="minorEastAsia" w:hAnsi="Cambria Math"/>
-                  <w:i/>
-                </w:rPr>
-              </m:ctrlPr>
-            </m:sSubPr>
-            <m:e>
-              <m:r>
-                <w:rPr>
-                  <w:rFonts w:ascii="Cambria Math" w:eastAsiaTheme="minorEastAsia" w:hAnsi="Cambria Math"/>
-                </w:rPr>
-                <m:t>Q</m:t>
-              </m:r>
-            </m:e>
-            <m:sub>
-              <m:r>
-                <w:rPr>
-                  <w:rFonts w:ascii="Cambria Math" w:eastAsiaTheme="minorEastAsia" w:hAnsi="Cambria Math"/>
-                </w:rPr>
-                <m:t>t</m:t>
-              </m:r>
-            </m:sub>
-          </m:sSub>
-          <m:r>
-            <w:rPr>
-              <w:rFonts w:ascii="Cambria Math" w:eastAsiaTheme="minorEastAsia" w:hAnsi="Cambria Math"/>
-            </w:rPr>
-            <m:t>-</m:t>
-          </m:r>
-          <m:sSub>
-            <m:sSubPr>
-              <m:ctrlPr>
-                <w:rPr>
-                  <w:rFonts w:ascii="Cambria Math" w:eastAsiaTheme="minorEastAsia" w:hAnsi="Cambria Math"/>
-                  <w:i/>
-                </w:rPr>
-              </m:ctrlPr>
-            </m:sSubPr>
-            <m:e>
-              <m:r>
-                <w:rPr>
-                  <w:rFonts w:ascii="Cambria Math" w:eastAsiaTheme="minorEastAsia" w:hAnsi="Cambria Math"/>
-                </w:rPr>
-                <m:t>Q</m:t>
-              </m:r>
-            </m:e>
-            <m:sub>
-              <m:r>
-                <w:rPr>
-                  <w:rFonts w:ascii="Cambria Math" w:eastAsiaTheme="minorEastAsia" w:hAnsi="Cambria Math"/>
-                </w:rPr>
-                <m:t>t-1</m:t>
-              </m:r>
-            </m:sub>
-          </m:sSub>
-        </m:oMath>
-      </m:oMathPara>
-    </w:p>
-    <w:p>
-      <w:r>
-        <w:t xml:space="preserve">Then these are summed across </w:t>
-      </w:r>
-      <w:proofErr w:type="spellStart"/>
-      <w:r>
-        <w:t>ro</w:t>
-      </w:r>
-      <w:proofErr w:type="spellEnd"/>
-      <w:r>
-        <w:t xml:space="preserve"> trains and </w:t>
-      </w:r>
-      <w:proofErr w:type="spellStart"/>
-      <w:r>
-        <w:t>uf</w:t>
-      </w:r>
-      <w:proofErr w:type="spellEnd"/>
-      <w:r>
-        <w:t xml:space="preserve"> pumps and scaled by a weight factor (w). Currently a scaling factor of 5 is used, essentially creating a $5 cost to vary the flowrate between hours. This is applied to shutdown/startups, but minor compared to cost savings from these choices. </w:t>
-      </w:r>
-    </w:p>
-    <w:p>
-      <m:oMathPara>
-        <m:oMath>
-          <m:sSub>
-            <m:sSubPr>
-              <m:ctrlPr>
-                <w:rPr>
-                  <w:rFonts w:ascii="Cambria Math" w:hAnsi="Cambria Math"/>
-                  <w:i/>
-                </w:rPr>
-              </m:ctrlPr>
-            </m:sSubPr>
-            <m:e>
-              <m:r>
-                <w:rPr>
-                  <w:rFonts w:ascii="Cambria Math" w:hAnsi="Cambria Math"/>
-                </w:rPr>
-                <m:t>p</m:t>
-              </m:r>
-            </m:e>
-            <m:sub>
-              <m:r>
-                <w:rPr>
-                  <w:rFonts w:ascii="Cambria Math" w:hAnsi="Cambria Math"/>
-                </w:rPr>
-                <m:t>flow</m:t>
-              </m:r>
-            </m:sub>
-          </m:sSub>
-          <m:r>
-            <w:rPr>
-              <w:rFonts w:ascii="Cambria Math" w:hAnsi="Cambria Math"/>
-            </w:rPr>
-            <m:t>=w</m:t>
-          </m:r>
-          <m:r>
-            <w:rPr>
-              <w:rFonts w:ascii="Cambria Math" w:eastAsiaTheme="minorEastAsia" w:hAnsi="Cambria Math"/>
-            </w:rPr>
-            <m:t>*()</m:t>
-          </m:r>
-        </m:oMath>
-      </m:oMathPara>
-    </w:p>
-    <w:p/>
-    <w:p>
-      <w:r>
-        <w:t>The objective function is then:</w:t>
-      </w:r>
-    </w:p>
-    <w:p>
-      <w:pPr>
-        <w:rPr>
-          <w:rFonts w:eastAsiaTheme="minorEastAsia"/>
-        </w:rPr>
-      </w:pPr>
-      <m:oMathPara>
-        <m:oMath>
-          <m:func>
-            <m:funcPr>
-              <m:ctrlPr>
-                <w:rPr>
-                  <w:rFonts w:ascii="Cambria Math" w:hAnsi="Cambria Math"/>
-                  <w:i/>
-                </w:rPr>
-              </m:ctrlPr>
-            </m:funcPr>
-            <m:fName>
-              <m:r>
-                <m:rPr>
-                  <m:sty m:val="p"/>
-                </m:rPr>
-                <w:rPr>
-                  <w:rFonts w:ascii="Cambria Math" w:hAnsi="Cambria Math"/>
-                </w:rPr>
-                <m:t>min</m:t>
-              </m:r>
-            </m:fName>
-            <m:e>
-              <m:sSub>
-                <m:sSubPr>
-                  <m:ctrlPr>
-                    <w:rPr>
-                      <w:rFonts w:ascii="Cambria Math" w:hAnsi="Cambria Math"/>
-                      <w:i/>
-                    </w:rPr>
-                  </m:ctrlPr>
-                </m:sSubPr>
-                <m:e>
-                  <m:r>
-                    <w:rPr>
-                      <w:rFonts w:ascii="Cambria Math" w:hAnsi="Cambria Math"/>
-                    </w:rPr>
-                    <m:t>C</m:t>
-                  </m:r>
-                </m:e>
-                <m:sub>
-                  <m:r>
-                    <w:rPr>
-                      <w:rFonts w:ascii="Cambria Math" w:hAnsi="Cambria Math"/>
-                    </w:rPr>
-                    <m:t>total</m:t>
-                  </m:r>
-                </m:sub>
-              </m:sSub>
-              <m:r>
-                <w:rPr>
-                  <w:rFonts w:ascii="Cambria Math" w:hAnsi="Cambria Math"/>
-                </w:rPr>
-                <m:t>+</m:t>
-              </m:r>
-              <m:sSub>
-                <m:sSubPr>
-                  <m:ctrlPr>
-                    <w:rPr>
-                      <w:rFonts w:ascii="Cambria Math" w:hAnsi="Cambria Math"/>
-                      <w:i/>
-                    </w:rPr>
-                  </m:ctrlPr>
-                </m:sSubPr>
-                <m:e>
-                  <m:r>
-                    <w:rPr>
-                      <w:rFonts w:ascii="Cambria Math" w:hAnsi="Cambria Math"/>
-                    </w:rPr>
-                    <m:t>p</m:t>
-                  </m:r>
-                </m:e>
-                <m:sub>
-                  <m:r>
-                    <w:rPr>
-                      <w:rFonts w:ascii="Cambria Math" w:hAnsi="Cambria Math"/>
-                    </w:rPr>
-                    <m:t>flow</m:t>
-                  </m:r>
-                </m:sub>
-              </m:sSub>
-            </m:e>
-          </m:func>
-        </m:oMath>
-      </m:oMathPara>
-    </w:p>
-    <w:p>
-      <w:r>
-        <w:rPr>
-          <w:rFonts w:eastAsiaTheme="minorEastAsia"/>
-        </w:rPr>
-        <w:t xml:space="preserve">where </w:t>
-      </w:r>
-      <w:proofErr w:type="spellStart"/>
-      <w:r>
-        <w:rPr>
-          <w:rFonts w:eastAsiaTheme="minorEastAsia"/>
-        </w:rPr>
-        <w:t>C</w:t>
-      </w:r>
-      <w:r>
-        <w:rPr>
-          <w:rFonts w:eastAsiaTheme="minorEastAsia"/>
-          <w:vertAlign w:val="subscript"/>
-        </w:rPr>
-        <w:t>total</w:t>
-      </w:r>
-      <w:proofErr w:type="spellEnd"/>
-      <w:r>
-        <w:t xml:space="preserve"> is energy, demand, brine, feed, chemicals, and replacement costs.</w:t>
-      </w:r>
-    </w:p>
-    <w:p>
-      <w:pPr>
-        <w:pStyle w:val="ListParagraph"/>
-        <w:numPr>
-          <w:ilvl w:val="0"/>
-          <w:numId w:val="1"/>
-        </w:numPr>
-        <w:spacing w:after="0" w:line="240" w:lineRule="auto"/>
-      </w:pPr>
-      <w:r>
-        <w:t>Optimization over Multiple time horizons</w:t>
-      </w:r>
-    </w:p>
-    <w:p/>
     <w:sectPr>
       <w:pgSz w:w="12240" w:h="15840"/>
       <w:pgMar w:top="1440" w:right="1440" w:bottom="1440" w:left="1440" w:header="720" w:footer="720" w:gutter="0"/>
@@ -2049,6 +1057,29 @@
       <w:spacing w:val="5"/>
     </w:rPr>
   </w:style>
+  <w:style w:type="character" w:styleId="Hyperlink">
+    <w:name w:val="Hyperlink"/>
+    <w:basedOn w:val="DefaultParagraphFont"/>
+    <w:uiPriority w:val="99"/>
+    <w:unhideWhenUsed/>
+    <w:rsid w:val="002D516D"/>
+    <w:rPr>
+      <w:color w:val="467886" w:themeColor="hyperlink"/>
+      <w:u w:val="single"/>
+    </w:rPr>
+  </w:style>
+  <w:style w:type="character" w:styleId="UnresolvedMention">
+    <w:name w:val="Unresolved Mention"/>
+    <w:basedOn w:val="DefaultParagraphFont"/>
+    <w:uiPriority w:val="99"/>
+    <w:semiHidden/>
+    <w:unhideWhenUsed/>
+    <w:rsid w:val="002D516D"/>
+    <w:rPr>
+      <w:color w:val="605E5C"/>
+      <w:shd w:val="clear" w:color="auto" w:fill="E1DFDD"/>
+    </w:rPr>
+  </w:style>
 </w:styles>
 </file>
 

</xml_diff>